<commit_message>
add 34 les file
</commit_message>
<xml_diff>
--- a/public/lesson-34.docx
+++ b/public/lesson-34.docx
@@ -5,9 +5,15 @@
     <w:p>
       <w:pPr>
         <w:pStyle w:val="Heading2"/>
+        <w:rPr>
+          <w:lang w:val="ru-RU"/>
+        </w:rPr>
       </w:pPr>
       <w:r>
-        <w:t>TODO</w:t>
+        <w:rPr>
+          <w:lang w:val="ru-RU"/>
+        </w:rPr>
+        <w:t>Конспект пока не готов</w:t>
       </w:r>
     </w:p>
     <w:sectPr>

</xml_diff>

<commit_message>
add 34 lesson 1 part
</commit_message>
<xml_diff>
--- a/public/lesson-34.docx
+++ b/public/lesson-34.docx
@@ -113,14 +113,7 @@
           <w:rFonts w:ascii="Times New Roman" w:hAnsi="Times New Roman" w:cs="Times New Roman"/>
           <w:lang w:val="ru-RU"/>
         </w:rPr>
-        <w:t xml:space="preserve"> конце концов его отдали под суд</w:t>
-      </w:r>
-      <w:r>
-        <w:rPr>
-          <w:rFonts w:ascii="Times New Roman" w:hAnsi="Times New Roman" w:cs="Times New Roman"/>
-          <w:lang w:val="ru-RU"/>
-        </w:rPr>
-        <w:t>.</w:t>
+        <w:t xml:space="preserve"> конце концов его отдали под суд.</w:t>
       </w:r>
     </w:p>
     <w:p>
@@ -157,16 +150,7 @@
           <w:szCs w:val="24"/>
           <w:lang w:val="ru-RU"/>
         </w:rPr>
-        <w:t>м</w:t>
-      </w:r>
-      <w:r>
-        <w:rPr>
-          <w:rFonts w:ascii="Times New Roman" w:hAnsi="Times New Roman" w:cs="Times New Roman"/>
-          <w:sz w:val="24"/>
-          <w:szCs w:val="24"/>
-          <w:lang w:val="ru-RU"/>
-        </w:rPr>
-        <w:t xml:space="preserve">ы </w:t>
+        <w:t xml:space="preserve">мы </w:t>
       </w:r>
       <w:r>
         <w:rPr>
@@ -1013,6 +997,7 @@
           <w:rFonts w:ascii="Times New Roman" w:hAnsi="Times New Roman" w:cs="Times New Roman"/>
           <w:sz w:val="24"/>
           <w:szCs w:val="24"/>
+          <w:lang w:val="ru-RU"/>
         </w:rPr>
       </w:pPr>
       <w:r>
@@ -1125,16 +1110,7 @@
           <w:szCs w:val="24"/>
           <w:lang w:val="ru-RU"/>
         </w:rPr>
-        <w:t xml:space="preserve">; </w:t>
-      </w:r>
-      <w:r>
-        <w:rPr>
-          <w:rFonts w:ascii="Times New Roman" w:hAnsi="Times New Roman" w:cs="Times New Roman"/>
-          <w:sz w:val="24"/>
-          <w:szCs w:val="24"/>
-          <w:lang w:val="ru-RU"/>
-        </w:rPr>
-        <w:t xml:space="preserve">делать появление новых </w:t>
+        <w:t xml:space="preserve">; делать появление новых </w:t>
       </w:r>
       <w:r>
         <w:rPr>
@@ -1154,16 +1130,7 @@
           <w:szCs w:val="24"/>
           <w:lang w:val="ru-RU"/>
         </w:rPr>
-        <w:t xml:space="preserve"> предсказуемым, сформировать ожидание, вытекающее из предыдущего опыта</w:t>
-      </w:r>
-      <w:r>
-        <w:rPr>
-          <w:rFonts w:ascii="Times New Roman" w:hAnsi="Times New Roman" w:cs="Times New Roman"/>
-          <w:sz w:val="24"/>
-          <w:szCs w:val="24"/>
-          <w:lang w:val="ru-RU"/>
-        </w:rPr>
-        <w:t xml:space="preserve">. </w:t>
+        <w:t xml:space="preserve"> предсказуемым, сформировать ожидание, вытекающее из предыдущего опыта. </w:t>
       </w:r>
       <w:r>
         <w:rPr>
@@ -2323,43 +2290,7 @@
           <w:szCs w:val="24"/>
           <w:lang w:val="ru-RU"/>
         </w:rPr>
-        <w:t xml:space="preserve">, </w:t>
-      </w:r>
-      <w:r>
-        <w:rPr>
-          <w:rFonts w:ascii="Times New Roman" w:hAnsi="Times New Roman" w:cs="Times New Roman"/>
-          <w:sz w:val="24"/>
-          <w:szCs w:val="24"/>
-          <w:lang w:val="ru-RU"/>
-        </w:rPr>
-        <w:t>похожи</w:t>
-      </w:r>
-      <w:r>
-        <w:rPr>
-          <w:rFonts w:ascii="Times New Roman" w:hAnsi="Times New Roman" w:cs="Times New Roman"/>
-          <w:sz w:val="24"/>
-          <w:szCs w:val="24"/>
-          <w:lang w:val="ru-RU"/>
-        </w:rPr>
-        <w:t>е</w:t>
-      </w:r>
-      <w:r>
-        <w:rPr>
-          <w:rFonts w:ascii="Times New Roman" w:hAnsi="Times New Roman" w:cs="Times New Roman"/>
-          <w:sz w:val="24"/>
-          <w:szCs w:val="24"/>
-          <w:lang w:val="ru-RU"/>
-        </w:rPr>
-        <w:t xml:space="preserve"> на поток;</w:t>
-      </w:r>
-      <w:r>
-        <w:rPr>
-          <w:rFonts w:ascii="Times New Roman" w:hAnsi="Times New Roman" w:cs="Times New Roman"/>
-          <w:sz w:val="24"/>
-          <w:szCs w:val="24"/>
-          <w:lang w:val="ru-RU"/>
-        </w:rPr>
-        <w:t xml:space="preserve"> то, </w:t>
+        <w:t xml:space="preserve">, похожие на поток; то, </w:t>
       </w:r>
       <w:r>
         <w:rPr>
@@ -2459,13 +2390,16 @@
       <w:r>
         <w:rPr>
           <w:rFonts w:ascii="Times New Roman" w:hAnsi="Times New Roman" w:cs="Times New Roman"/>
+          <w:noProof/>
+          <w:sz w:val="24"/>
+          <w:szCs w:val="24"/>
           <w:lang w:val="ru-RU"/>
         </w:rPr>
         <w:drawing>
-          <wp:inline distT="0" distB="0" distL="0" distR="0" wp14:anchorId="0753D01E" wp14:editId="3563B8C9">
-            <wp:extent cx="2997651" cy="2982897"/>
+          <wp:inline distT="0" distB="0" distL="0" distR="0">
+            <wp:extent cx="2045970" cy="2011871"/>
             <wp:effectExtent l="0" t="0" r="0" b="0"/>
-            <wp:docPr id="148933518" name="Picture 1" descr="субъект-объектная схема поля опыта"/>
+            <wp:docPr id="477351540" name="Picture 1"/>
             <wp:cNvGraphicFramePr>
               <a:graphicFrameLocks xmlns:a="http://schemas.openxmlformats.org/drawingml/2006/main" noChangeAspect="1"/>
             </wp:cNvGraphicFramePr>
@@ -2473,32 +2407,29 @@
               <a:graphicData uri="http://schemas.openxmlformats.org/drawingml/2006/picture">
                 <pic:pic xmlns:pic="http://schemas.openxmlformats.org/drawingml/2006/picture">
                   <pic:nvPicPr>
-                    <pic:cNvPr id="148933518" name="Picture 1" descr="субъект-объектная схема поля опыта"/>
+                    <pic:cNvPr id="477351540" name="Picture 477351540"/>
                     <pic:cNvPicPr/>
                   </pic:nvPicPr>
-                  <pic:blipFill rotWithShape="1">
-                    <a:blip r:embed="rId6"/>
-                    <a:srcRect t="6374"/>
+                  <pic:blipFill>
+                    <a:blip r:embed="rId6" cstate="print">
+                      <a:extLst>
+                        <a:ext uri="{28A0092B-C50C-407E-A947-70E740481C1C}">
+                          <a14:useLocalDpi xmlns:a14="http://schemas.microsoft.com/office/drawing/2010/main" val="0"/>
+                        </a:ext>
+                      </a:extLst>
+                    </a:blip>
                     <a:stretch>
                       <a:fillRect/>
                     </a:stretch>
                   </pic:blipFill>
-                  <pic:spPr bwMode="auto">
+                  <pic:spPr>
                     <a:xfrm>
                       <a:off x="0" y="0"/>
-                      <a:ext cx="3253203" cy="3237192"/>
+                      <a:ext cx="2065255" cy="2030835"/>
                     </a:xfrm>
                     <a:prstGeom prst="rect">
                       <a:avLst/>
                     </a:prstGeom>
-                    <a:ln>
-                      <a:noFill/>
-                    </a:ln>
-                    <a:extLst>
-                      <a:ext uri="{53640926-AAD7-44D8-BBD7-CCE9431645EC}">
-                        <a14:shadowObscured xmlns:a14="http://schemas.microsoft.com/office/drawing/2010/main"/>
-                      </a:ext>
-                    </a:extLst>
                   </pic:spPr>
                 </pic:pic>
               </a:graphicData>
@@ -2513,6 +2444,7 @@
           <w:rFonts w:ascii="Times New Roman" w:hAnsi="Times New Roman" w:cs="Times New Roman"/>
           <w:sz w:val="24"/>
           <w:szCs w:val="24"/>
+          <w:lang w:val="ru-RU"/>
         </w:rPr>
       </w:pPr>
       <w:r>
@@ -2522,7 +2454,6 @@
           <w:szCs w:val="24"/>
           <w:lang w:val="ru-RU"/>
         </w:rPr>
-        <w:lastRenderedPageBreak/>
         <w:t>Отсюда и берется «двойная онтология» Юма — есть объект, есть не-объект, названный зонтичным термином субъект.</w:t>
       </w:r>
       <w:r>
@@ -2702,6 +2633,7 @@
           <w:bCs/>
           <w:lang w:val="ru-RU"/>
         </w:rPr>
+        <w:lastRenderedPageBreak/>
         <w:t>Вопрос из зала</w:t>
       </w:r>
       <w:r>
@@ -2811,68 +2743,453 @@
     </w:p>
     <w:p>
       <w:pPr>
-        <w:pStyle w:val="Heading3"/>
         <w:rPr>
           <w:rFonts w:ascii="Times New Roman" w:hAnsi="Times New Roman" w:cs="Times New Roman"/>
           <w:lang w:val="ru-RU"/>
         </w:rPr>
       </w:pPr>
-      <w:r>
-        <w:rPr>
-          <w:rFonts w:ascii="Times New Roman" w:hAnsi="Times New Roman" w:cs="Times New Roman"/>
-          <w:lang w:val="ru-RU"/>
-        </w:rPr>
-        <w:t>Ни субъект, ни объект</w:t>
-      </w:r>
     </w:p>
     <w:p>
       <w:pPr>
+        <w:pStyle w:val="Quote"/>
         <w:rPr>
           <w:rFonts w:ascii="Times New Roman" w:hAnsi="Times New Roman" w:cs="Times New Roman"/>
           <w:lang w:val="ru-RU"/>
         </w:rPr>
       </w:pPr>
-      <w:r>
-        <w:rPr>
-          <w:rFonts w:ascii="Times New Roman" w:hAnsi="Times New Roman" w:cs="Times New Roman"/>
-          <w:sz w:val="24"/>
-          <w:szCs w:val="24"/>
-          <w:lang w:val="ru-RU"/>
-        </w:rPr>
-        <w:t>Е</w:t>
-      </w:r>
-      <w:r>
-        <w:rPr>
-          <w:rFonts w:ascii="Times New Roman" w:hAnsi="Times New Roman" w:cs="Times New Roman"/>
-          <w:sz w:val="24"/>
-          <w:szCs w:val="24"/>
-          <w:lang w:val="ru-RU"/>
-        </w:rPr>
-        <w:t xml:space="preserve">сть </w:t>
-      </w:r>
-      <w:r>
-        <w:rPr>
-          <w:rFonts w:ascii="Times New Roman" w:hAnsi="Times New Roman" w:cs="Times New Roman"/>
-          <w:sz w:val="24"/>
-          <w:szCs w:val="24"/>
-          <w:lang w:val="ru-RU"/>
-        </w:rPr>
-        <w:t xml:space="preserve">и </w:t>
-      </w:r>
-      <w:r>
-        <w:rPr>
-          <w:rFonts w:ascii="Times New Roman" w:hAnsi="Times New Roman" w:cs="Times New Roman"/>
-          <w:sz w:val="24"/>
-          <w:szCs w:val="24"/>
-          <w:lang w:val="ru-RU"/>
-        </w:rPr>
-        <w:t xml:space="preserve">кое-что, что не влезает ни в субъект, ни в объект, и это </w:t>
-      </w:r>
       <w:r>
         <w:rPr>
           <w:rFonts w:ascii="Times New Roman" w:hAnsi="Times New Roman" w:cs="Times New Roman"/>
           <w:b/>
           <w:bCs/>
+          <w:lang w:val="ru-RU"/>
+        </w:rPr>
+        <w:t>Вопрос из зала</w:t>
+      </w:r>
+      <w:r>
+        <w:rPr>
+          <w:rFonts w:ascii="Times New Roman" w:hAnsi="Times New Roman" w:cs="Times New Roman"/>
+          <w:lang w:val="ru-RU"/>
+        </w:rPr>
+        <w:t>: субъект — это те идеи, которые никак не могут связаться между собой причиной. Но ведь я, как субъект, нахожу причинно-следственные связи в своих мыслях: одна мысль у меня в голове довольно логично перетекает в другую. Значит, они всё-таки связываемые?</w:t>
+      </w:r>
+    </w:p>
+    <w:p>
+      <w:pPr>
+        <w:pStyle w:val="Quote"/>
+        <w:rPr>
+          <w:rFonts w:ascii="Times New Roman" w:hAnsi="Times New Roman" w:cs="Times New Roman"/>
+          <w:lang w:val="ru-RU"/>
+        </w:rPr>
+      </w:pPr>
+      <w:r>
+        <w:rPr>
+          <w:rFonts w:ascii="Times New Roman" w:hAnsi="Times New Roman" w:cs="Times New Roman"/>
+          <w:b/>
+          <w:bCs/>
+          <w:lang w:val="ru-RU"/>
+        </w:rPr>
+        <w:t>Ответ</w:t>
+      </w:r>
+      <w:r>
+        <w:rPr>
+          <w:rFonts w:ascii="Times New Roman" w:hAnsi="Times New Roman" w:cs="Times New Roman"/>
+          <w:lang w:val="ru-RU"/>
+        </w:rPr>
+        <w:t xml:space="preserve">: противоречия здесь нет. «Свалив» все беспричинные идеи в субъект, принцип ассоциации пытается наладить стройность и там. Вам, как субъекту, </w:t>
+      </w:r>
+      <w:r>
+        <w:rPr>
+          <w:rFonts w:ascii="Times New Roman" w:hAnsi="Times New Roman" w:cs="Times New Roman"/>
+          <w:lang w:val="ru-RU"/>
+        </w:rPr>
+        <w:t>настроенные</w:t>
+      </w:r>
+      <w:r>
+        <w:rPr>
+          <w:rFonts w:ascii="Times New Roman" w:hAnsi="Times New Roman" w:cs="Times New Roman"/>
+          <w:lang w:val="ru-RU"/>
+        </w:rPr>
+        <w:t xml:space="preserve"> ассоциации могут казаться логичными: например, мне было грустно, потом стало весело; отрефлексировав, я нашел причину в перепаде настроения. Истинна ли эта причина? Ровно настолько</w:t>
+      </w:r>
+      <w:r>
+        <w:rPr>
+          <w:rFonts w:ascii="Times New Roman" w:hAnsi="Times New Roman" w:cs="Times New Roman"/>
+          <w:lang w:val="ru-RU"/>
+        </w:rPr>
+        <w:t xml:space="preserve"> же</w:t>
+      </w:r>
+      <w:r>
+        <w:rPr>
+          <w:rFonts w:ascii="Times New Roman" w:hAnsi="Times New Roman" w:cs="Times New Roman"/>
+          <w:lang w:val="ru-RU"/>
+        </w:rPr>
+        <w:t>, насколько и все остальные.</w:t>
+      </w:r>
+      <w:r>
+        <w:rPr>
+          <w:rFonts w:ascii="Times New Roman" w:hAnsi="Times New Roman" w:cs="Times New Roman"/>
+          <w:lang w:val="ru-RU"/>
+        </w:rPr>
+        <w:t xml:space="preserve"> </w:t>
+      </w:r>
+      <w:r>
+        <w:rPr>
+          <w:rFonts w:ascii="Times New Roman" w:hAnsi="Times New Roman" w:cs="Times New Roman"/>
+          <w:lang w:val="ru-RU"/>
+        </w:rPr>
+        <w:t>«Логичная» связь между вашими мыслями — это</w:t>
+      </w:r>
+      <w:r>
+        <w:rPr>
+          <w:rFonts w:ascii="Times New Roman" w:hAnsi="Times New Roman" w:cs="Times New Roman"/>
+          <w:lang w:val="ru-RU"/>
+        </w:rPr>
+        <w:t xml:space="preserve"> </w:t>
+      </w:r>
+      <w:r>
+        <w:rPr>
+          <w:rFonts w:ascii="Times New Roman" w:hAnsi="Times New Roman" w:cs="Times New Roman"/>
+          <w:lang w:val="ru-RU"/>
+        </w:rPr>
+        <w:t>такая же иллюзия, как и связь между объектами.</w:t>
+      </w:r>
+    </w:p>
+    <w:p>
+      <w:pPr>
+        <w:rPr>
+          <w:lang w:val="ru-RU"/>
+        </w:rPr>
+      </w:pPr>
+    </w:p>
+    <w:p>
+      <w:pPr>
+        <w:pStyle w:val="Quote"/>
+        <w:rPr>
+          <w:lang w:val="ru-RU"/>
+        </w:rPr>
+      </w:pPr>
+      <w:r>
+        <w:rPr>
+          <w:lang w:val="ru-RU"/>
+        </w:rPr>
+        <w:t>Вопрос из зала: есть ли операция, обратная ассоциации?</w:t>
+      </w:r>
+      <w:r>
+        <w:rPr>
+          <w:lang w:val="ru-RU"/>
+        </w:rPr>
+        <w:br/>
+        <w:t xml:space="preserve">Ответ: то есть </w:t>
+      </w:r>
+      <w:r>
+        <w:rPr>
+          <w:lang w:val="ru-RU"/>
+        </w:rPr>
+        <w:t>диссоциация</w:t>
+      </w:r>
+      <w:r>
+        <w:rPr>
+          <w:lang w:val="ru-RU"/>
+        </w:rPr>
+        <w:t xml:space="preserve">? Похоже на психические расстройства. Такой темы Юм не поднимал. </w:t>
+      </w:r>
+      <w:r>
+        <w:rPr>
+          <w:lang w:val="ru-RU"/>
+        </w:rPr>
+        <w:t>Скорее всего</w:t>
+      </w:r>
+      <w:r>
+        <w:rPr>
+          <w:lang w:val="ru-RU"/>
+        </w:rPr>
+        <w:t xml:space="preserve"> ассоциация может разрушаться с помощью самого принципа ассоциации: когда создается новая связь, прочнее предыдущей, </w:t>
+      </w:r>
+      <w:r>
+        <w:rPr>
+          <w:lang w:val="ru-RU"/>
+        </w:rPr>
+        <w:t>старая разрушается.</w:t>
+      </w:r>
+      <w:r>
+        <w:rPr>
+          <w:lang w:val="ru-RU"/>
+        </w:rPr>
+        <w:t xml:space="preserve"> Главное — сохранять непрерывность.</w:t>
+      </w:r>
+      <w:r>
+        <w:rPr>
+          <w:lang w:val="ru-RU"/>
+        </w:rPr>
+        <w:t xml:space="preserve"> Примером послужит любое изменение вашего отношения к чему угодно.</w:t>
+      </w:r>
+      <w:r>
+        <w:rPr>
+          <w:lang w:val="ru-RU"/>
+        </w:rPr>
+        <w:t xml:space="preserve"> Немного забежим вперед и рассмотрим пример того, как </w:t>
+      </w:r>
+      <w:r>
+        <w:rPr>
+          <w:lang w:val="ru-RU"/>
+        </w:rPr>
+        <w:t xml:space="preserve">работает принцип ассоциации </w:t>
+      </w:r>
+      <w:r>
+        <w:rPr>
+          <w:lang w:val="ru-RU"/>
+        </w:rPr>
+        <w:t>у шизофреников</w:t>
+      </w:r>
+      <w:r>
+        <w:rPr>
+          <w:lang w:val="ru-RU"/>
+        </w:rPr>
+        <w:t xml:space="preserve">. </w:t>
+      </w:r>
+      <w:r>
+        <w:rPr>
+          <w:lang w:val="ru-RU"/>
+        </w:rPr>
+        <w:t>Главное р</w:t>
+      </w:r>
+      <w:r>
+        <w:rPr>
+          <w:lang w:val="ru-RU"/>
+        </w:rPr>
+        <w:t>азличие заключается в характере того, как они устанавливают связи.</w:t>
+      </w:r>
+      <w:r>
+        <w:rPr>
+          <w:lang w:val="ru-RU"/>
+        </w:rPr>
+        <w:t xml:space="preserve"> Французский писатель Анри Мишо</w:t>
+      </w:r>
+      <w:r>
+        <w:rPr>
+          <w:lang w:val="ru-RU"/>
+        </w:rPr>
+        <w:t xml:space="preserve"> описывал такое явление как «шизофренический стол»</w:t>
+      </w:r>
+      <w:r>
+        <w:rPr>
+          <w:lang w:val="ru-RU"/>
+        </w:rPr>
+        <w:t xml:space="preserve">: если дать нарисовать человеку стол, он скорее всего нарисует обычный стол, плоский или в перспективе. Если дать нарисовать стол шизофренику, </w:t>
+      </w:r>
+      <w:r>
+        <w:rPr>
+          <w:lang w:val="ru-RU"/>
+        </w:rPr>
+        <w:t>он нарисует ножки, столешницу, на ней лист бумаги, книгу</w:t>
+      </w:r>
+      <w:r>
+        <w:rPr>
+          <w:lang w:val="ru-RU"/>
+        </w:rPr>
+        <w:t>;</w:t>
+      </w:r>
+      <w:r>
+        <w:rPr>
+          <w:lang w:val="ru-RU"/>
+        </w:rPr>
+        <w:t xml:space="preserve"> затем настольную лампу, трещины на столе, телефон, стакан чая</w:t>
+      </w:r>
+      <w:r>
+        <w:rPr>
+          <w:lang w:val="ru-RU"/>
+        </w:rPr>
+        <w:t>; затем</w:t>
+      </w:r>
+      <w:r>
+        <w:rPr>
+          <w:lang w:val="ru-RU"/>
+        </w:rPr>
+        <w:t xml:space="preserve"> </w:t>
+      </w:r>
+      <w:r>
+        <w:rPr>
+          <w:lang w:val="ru-RU"/>
+        </w:rPr>
+        <w:t>керосиновую</w:t>
+      </w:r>
+      <w:r>
+        <w:rPr>
+          <w:lang w:val="ru-RU"/>
+        </w:rPr>
+        <w:t xml:space="preserve"> лам</w:t>
+      </w:r>
+      <w:r>
+        <w:rPr>
+          <w:lang w:val="ru-RU"/>
+        </w:rPr>
+        <w:t>п</w:t>
+      </w:r>
+      <w:r>
+        <w:rPr>
+          <w:lang w:val="ru-RU"/>
+        </w:rPr>
+        <w:t xml:space="preserve">у, </w:t>
+      </w:r>
+      <w:r>
+        <w:rPr>
+          <w:lang w:val="ru-RU"/>
+        </w:rPr>
+        <w:t>корову — он не может остановиться. Такое ощущение, что механизм стабилизации, который работает у обычных людей в среднем одинаково, у них работает совершенно иначе.</w:t>
+      </w:r>
+      <w:r>
+        <w:rPr>
+          <w:lang w:val="ru-RU"/>
+        </w:rPr>
+        <w:t xml:space="preserve"> Привычка в том смысле, в каком она есть у обычных людей, у них не формируется</w:t>
+      </w:r>
+      <w:r>
+        <w:rPr>
+          <w:lang w:val="ru-RU"/>
+        </w:rPr>
+        <w:t>;</w:t>
+      </w:r>
+      <w:r>
+        <w:rPr>
+          <w:lang w:val="ru-RU"/>
+        </w:rPr>
+        <w:t xml:space="preserve"> формируется иная привычка, которая</w:t>
+      </w:r>
+      <w:r>
+        <w:rPr>
+          <w:lang w:val="ru-RU"/>
+        </w:rPr>
+        <w:t xml:space="preserve"> </w:t>
+      </w:r>
+      <w:r>
+        <w:rPr>
+          <w:lang w:val="ru-RU"/>
+        </w:rPr>
+        <w:t>с нашей точки зрения кажется</w:t>
+      </w:r>
+      <w:r>
+        <w:rPr>
+          <w:lang w:val="ru-RU"/>
+        </w:rPr>
+        <w:t xml:space="preserve"> </w:t>
+      </w:r>
+      <w:r>
+        <w:rPr>
+          <w:lang w:val="ru-RU"/>
+        </w:rPr>
+        <w:t>сплошн</w:t>
+      </w:r>
+      <w:r>
+        <w:rPr>
+          <w:lang w:val="ru-RU"/>
+        </w:rPr>
+        <w:t>ой</w:t>
+      </w:r>
+      <w:r>
+        <w:rPr>
+          <w:lang w:val="ru-RU"/>
+        </w:rPr>
+        <w:t xml:space="preserve"> нестабильность</w:t>
+      </w:r>
+      <w:r>
+        <w:rPr>
+          <w:lang w:val="ru-RU"/>
+        </w:rPr>
+        <w:t>ю</w:t>
+      </w:r>
+      <w:r>
+        <w:rPr>
+          <w:lang w:val="ru-RU"/>
+        </w:rPr>
+        <w:t>.</w:t>
+      </w:r>
+      <w:r>
+        <w:rPr>
+          <w:lang w:val="ru-RU"/>
+        </w:rPr>
+        <w:t xml:space="preserve"> Шизофреник не останавливается на том смоделированном мире, который возникает в нашем опыте.</w:t>
+      </w:r>
+      <w:r>
+        <w:rPr>
+          <w:lang w:val="ru-RU"/>
+        </w:rPr>
+        <w:t xml:space="preserve"> Он проникает глубже в поле опыта и исследует больше возможностей, расширяя ассоциативные связи.</w:t>
+      </w:r>
+      <w:r>
+        <w:rPr>
+          <w:lang w:val="ru-RU"/>
+        </w:rPr>
+        <w:t xml:space="preserve"> Ему будто не хватает субъектно-объектной модели, по поверхности которой скользит обычный человек.</w:t>
+      </w:r>
+    </w:p>
+    <w:p>
+      <w:pPr>
+        <w:pStyle w:val="Heading3"/>
+        <w:rPr>
+          <w:rFonts w:ascii="Times New Roman" w:hAnsi="Times New Roman" w:cs="Times New Roman"/>
+          <w:lang w:val="ru-RU"/>
+        </w:rPr>
+      </w:pPr>
+      <w:r>
+        <w:rPr>
+          <w:rFonts w:ascii="Times New Roman" w:hAnsi="Times New Roman" w:cs="Times New Roman"/>
+          <w:lang w:val="ru-RU"/>
+        </w:rPr>
+        <w:lastRenderedPageBreak/>
+        <w:t>Ни субъект, ни объект</w:t>
+      </w:r>
+    </w:p>
+    <w:p>
+      <w:pPr>
+        <w:rPr>
+          <w:rFonts w:ascii="Times New Roman" w:hAnsi="Times New Roman" w:cs="Times New Roman"/>
+          <w:sz w:val="24"/>
+          <w:szCs w:val="24"/>
+          <w:lang w:val="ru-RU"/>
+        </w:rPr>
+      </w:pPr>
+      <w:r>
+        <w:rPr>
+          <w:rFonts w:ascii="Times New Roman" w:hAnsi="Times New Roman" w:cs="Times New Roman"/>
+          <w:sz w:val="24"/>
+          <w:szCs w:val="24"/>
+          <w:lang w:val="ru-RU"/>
+        </w:rPr>
+        <w:t>Е</w:t>
+      </w:r>
+      <w:r>
+        <w:rPr>
+          <w:rFonts w:ascii="Times New Roman" w:hAnsi="Times New Roman" w:cs="Times New Roman"/>
+          <w:sz w:val="24"/>
+          <w:szCs w:val="24"/>
+          <w:lang w:val="ru-RU"/>
+        </w:rPr>
+        <w:t xml:space="preserve">сть </w:t>
+      </w:r>
+      <w:r>
+        <w:rPr>
+          <w:rFonts w:ascii="Times New Roman" w:hAnsi="Times New Roman" w:cs="Times New Roman"/>
+          <w:sz w:val="24"/>
+          <w:szCs w:val="24"/>
+          <w:lang w:val="ru-RU"/>
+        </w:rPr>
+        <w:t xml:space="preserve">и </w:t>
+      </w:r>
+      <w:r>
+        <w:rPr>
+          <w:rFonts w:ascii="Times New Roman" w:hAnsi="Times New Roman" w:cs="Times New Roman"/>
+          <w:sz w:val="24"/>
+          <w:szCs w:val="24"/>
+          <w:lang w:val="ru-RU"/>
+        </w:rPr>
+        <w:t xml:space="preserve">кое-что, что не влезает ни в субъект, ни в объект, и это </w:t>
+      </w:r>
+      <w:r>
+        <w:rPr>
+          <w:rFonts w:ascii="Times New Roman" w:hAnsi="Times New Roman" w:cs="Times New Roman"/>
+          <w:b/>
+          <w:bCs/>
           <w:sz w:val="24"/>
           <w:szCs w:val="24"/>
         </w:rPr>
@@ -2933,43 +3250,1189 @@
           <w:szCs w:val="24"/>
           <w:lang w:val="ru-RU"/>
         </w:rPr>
+        <w:t xml:space="preserve"> относится и </w:t>
+      </w:r>
+      <w:r>
+        <w:rPr>
+          <w:rFonts w:ascii="Times New Roman" w:hAnsi="Times New Roman" w:cs="Times New Roman"/>
+          <w:sz w:val="24"/>
+          <w:szCs w:val="24"/>
+          <w:lang w:val="ru-RU"/>
+        </w:rPr>
+        <w:t>к субъекту,</w:t>
+      </w:r>
+      <w:r>
+        <w:rPr>
+          <w:rFonts w:ascii="Times New Roman" w:hAnsi="Times New Roman" w:cs="Times New Roman"/>
+          <w:sz w:val="24"/>
+          <w:szCs w:val="24"/>
+          <w:lang w:val="ru-RU"/>
+        </w:rPr>
+        <w:t xml:space="preserve"> и к объекту</w:t>
+      </w:r>
+      <w:r>
+        <w:rPr>
+          <w:rFonts w:ascii="Times New Roman" w:hAnsi="Times New Roman" w:cs="Times New Roman"/>
+          <w:sz w:val="24"/>
+          <w:szCs w:val="24"/>
+          <w:lang w:val="ru-RU"/>
+        </w:rPr>
+        <w:t xml:space="preserve"> — это то, что произошло в объекте, чего «я» как субъект ещё не видел.</w:t>
+      </w:r>
+    </w:p>
+    <w:p>
+      <w:pPr>
+        <w:pStyle w:val="Heading2"/>
+        <w:rPr>
+          <w:lang w:val="ru-RU"/>
+        </w:rPr>
+      </w:pPr>
+      <w:r>
+        <w:rPr>
+          <w:lang w:val="ru-RU"/>
+        </w:rPr>
+        <w:t>Новая веха</w:t>
+      </w:r>
+    </w:p>
+    <w:p>
+      <w:pPr>
+        <w:rPr>
+          <w:rFonts w:ascii="Times New Roman" w:hAnsi="Times New Roman" w:cs="Times New Roman"/>
+          <w:lang w:val="ru-RU"/>
+        </w:rPr>
+      </w:pPr>
+      <w:r>
+        <w:rPr>
+          <w:rFonts w:ascii="Times New Roman" w:hAnsi="Times New Roman" w:cs="Times New Roman"/>
+          <w:lang w:val="ru-RU"/>
+        </w:rPr>
+        <w:t xml:space="preserve">Итак, мы </w:t>
+      </w:r>
+      <w:r>
+        <w:rPr>
+          <w:rFonts w:ascii="Times New Roman" w:hAnsi="Times New Roman" w:cs="Times New Roman"/>
+          <w:lang w:val="ru-RU"/>
+        </w:rPr>
+        <w:t>получили философское учение, которое является вехой в отношении ЭН и философии. После этого учения пути философии и ЭН расходятся.</w:t>
+      </w:r>
+      <w:r>
+        <w:rPr>
+          <w:rFonts w:ascii="Times New Roman" w:hAnsi="Times New Roman" w:cs="Times New Roman"/>
+          <w:lang w:val="ru-RU"/>
+        </w:rPr>
+        <w:t xml:space="preserve"> Важно понимать, что до Юма жанровой спецификации философии отдельно от естественно-научного исследования не было. </w:t>
+      </w:r>
+      <w:r>
+        <w:rPr>
+          <w:rFonts w:ascii="Times New Roman" w:hAnsi="Times New Roman" w:cs="Times New Roman"/>
+          <w:lang w:val="ru-RU"/>
+        </w:rPr>
+        <w:t>Например, р</w:t>
+      </w:r>
+      <w:r>
+        <w:rPr>
+          <w:rFonts w:ascii="Times New Roman" w:hAnsi="Times New Roman" w:cs="Times New Roman"/>
+          <w:lang w:val="ru-RU"/>
+        </w:rPr>
+        <w:t>абота Ньютона, в которой излагаются базовые принципы механики, называется «математические начала натуральной философии».</w:t>
+      </w:r>
+      <w:r>
+        <w:rPr>
+          <w:rFonts w:ascii="Times New Roman" w:hAnsi="Times New Roman" w:cs="Times New Roman"/>
+          <w:lang w:val="ru-RU"/>
+        </w:rPr>
+        <w:t xml:space="preserve"> Заниматься наукой</w:t>
+      </w:r>
+      <w:r>
+        <w:rPr>
+          <w:rFonts w:ascii="Times New Roman" w:hAnsi="Times New Roman" w:cs="Times New Roman"/>
+          <w:lang w:val="ru-RU"/>
+        </w:rPr>
+        <w:t xml:space="preserve"> значило заниматься </w:t>
+      </w:r>
+      <w:r>
+        <w:rPr>
+          <w:rFonts w:ascii="Times New Roman" w:hAnsi="Times New Roman" w:cs="Times New Roman"/>
+          <w:lang w:val="ru-RU"/>
+        </w:rPr>
+        <w:t>и философией.</w:t>
+      </w:r>
+      <w:r>
+        <w:rPr>
+          <w:rFonts w:ascii="Times New Roman" w:hAnsi="Times New Roman" w:cs="Times New Roman"/>
+          <w:lang w:val="ru-RU"/>
+        </w:rPr>
         <w:t xml:space="preserve"> </w:t>
       </w:r>
       <w:r>
         <w:rPr>
           <w:rFonts w:ascii="Times New Roman" w:hAnsi="Times New Roman" w:cs="Times New Roman"/>
-          <w:sz w:val="24"/>
-          <w:szCs w:val="24"/>
-          <w:lang w:val="ru-RU"/>
-        </w:rPr>
-        <w:t xml:space="preserve">относится и </w:t>
-      </w:r>
-      <w:r>
-        <w:rPr>
-          <w:rFonts w:ascii="Times New Roman" w:hAnsi="Times New Roman" w:cs="Times New Roman"/>
-          <w:sz w:val="24"/>
-          <w:szCs w:val="24"/>
-          <w:lang w:val="ru-RU"/>
-        </w:rPr>
-        <w:t>к субъекту,</w:t>
-      </w:r>
-      <w:r>
-        <w:rPr>
-          <w:rFonts w:ascii="Times New Roman" w:hAnsi="Times New Roman" w:cs="Times New Roman"/>
-          <w:sz w:val="24"/>
-          <w:szCs w:val="24"/>
-          <w:lang w:val="ru-RU"/>
-        </w:rPr>
-        <w:t xml:space="preserve"> и к объекту</w:t>
-      </w:r>
-      <w:r>
-        <w:rPr>
-          <w:rFonts w:ascii="Times New Roman" w:hAnsi="Times New Roman" w:cs="Times New Roman"/>
-          <w:sz w:val="24"/>
-          <w:szCs w:val="24"/>
-          <w:lang w:val="ru-RU"/>
-        </w:rPr>
-        <w:t xml:space="preserve"> — это то, что произошло в объекте, чего «я» как субъект ещё не видел.</w:t>
+          <w:lang w:val="ru-RU"/>
+        </w:rPr>
+        <w:t>Что же такого сделал Юм, что их пути разошлись?</w:t>
+      </w:r>
+    </w:p>
+    <w:p>
+      <w:pPr>
+        <w:rPr>
+          <w:rFonts w:ascii="Times New Roman" w:hAnsi="Times New Roman" w:cs="Times New Roman"/>
+          <w:lang w:val="ru-RU"/>
+        </w:rPr>
+      </w:pPr>
+      <w:r>
+        <w:rPr>
+          <w:rFonts w:ascii="Times New Roman" w:hAnsi="Times New Roman" w:cs="Times New Roman"/>
+          <w:lang w:val="ru-RU"/>
+        </w:rPr>
+        <w:t xml:space="preserve">То поле </w:t>
+      </w:r>
+      <w:r>
+        <w:rPr>
+          <w:rFonts w:ascii="Times New Roman" w:hAnsi="Times New Roman" w:cs="Times New Roman"/>
+          <w:i/>
+          <w:iCs/>
+          <w:lang w:val="ru-RU"/>
+        </w:rPr>
+        <w:t>опыта/корреляции</w:t>
+      </w:r>
+      <w:r>
+        <w:rPr>
+          <w:rFonts w:ascii="Times New Roman" w:hAnsi="Times New Roman" w:cs="Times New Roman"/>
+          <w:lang w:val="ru-RU"/>
+        </w:rPr>
+        <w:t xml:space="preserve">, которое он создал — это </w:t>
+      </w:r>
+      <w:r>
+        <w:rPr>
+          <w:rFonts w:ascii="Times New Roman" w:hAnsi="Times New Roman" w:cs="Times New Roman"/>
+          <w:b/>
+          <w:bCs/>
+          <w:lang w:val="ru-RU"/>
+        </w:rPr>
+        <w:t>новый теоретический объект</w:t>
+      </w:r>
+      <w:r>
+        <w:rPr>
+          <w:rFonts w:ascii="Times New Roman" w:hAnsi="Times New Roman" w:cs="Times New Roman"/>
+          <w:lang w:val="ru-RU"/>
+        </w:rPr>
+        <w:t>.</w:t>
+      </w:r>
+      <w:r>
+        <w:rPr>
+          <w:rFonts w:ascii="Times New Roman" w:hAnsi="Times New Roman" w:cs="Times New Roman"/>
+          <w:lang w:val="ru-RU"/>
+        </w:rPr>
+        <w:t xml:space="preserve"> В ней и субъект и объект были устранены как </w:t>
+      </w:r>
+      <w:r>
+        <w:rPr>
+          <w:rFonts w:ascii="Times New Roman" w:hAnsi="Times New Roman" w:cs="Times New Roman"/>
+          <w:i/>
+          <w:iCs/>
+          <w:lang w:val="ru-RU"/>
+        </w:rPr>
+        <w:t>субстанции</w:t>
+      </w:r>
+      <w:r>
+        <w:rPr>
+          <w:rFonts w:ascii="Times New Roman" w:hAnsi="Times New Roman" w:cs="Times New Roman"/>
+          <w:lang w:val="ru-RU"/>
+        </w:rPr>
+        <w:t>.</w:t>
+      </w:r>
+      <w:r>
+        <w:rPr>
+          <w:rFonts w:ascii="Times New Roman" w:hAnsi="Times New Roman" w:cs="Times New Roman"/>
+          <w:lang w:val="ru-RU"/>
+        </w:rPr>
+        <w:t xml:space="preserve"> </w:t>
+      </w:r>
+      <w:r>
+        <w:rPr>
+          <w:rFonts w:ascii="Times New Roman" w:hAnsi="Times New Roman" w:cs="Times New Roman"/>
+          <w:lang w:val="ru-RU"/>
+        </w:rPr>
+        <w:t xml:space="preserve">Задача </w:t>
+      </w:r>
+      <w:r>
+        <w:rPr>
+          <w:rFonts w:ascii="Times New Roman" w:hAnsi="Times New Roman" w:cs="Times New Roman"/>
+          <w:lang w:val="ru-RU"/>
+        </w:rPr>
+        <w:t xml:space="preserve">же </w:t>
+      </w:r>
+      <w:r>
+        <w:rPr>
+          <w:rFonts w:ascii="Times New Roman" w:hAnsi="Times New Roman" w:cs="Times New Roman"/>
+          <w:lang w:val="ru-RU"/>
+        </w:rPr>
+        <w:t>н</w:t>
+      </w:r>
+      <w:r>
+        <w:rPr>
+          <w:rFonts w:ascii="Times New Roman" w:hAnsi="Times New Roman" w:cs="Times New Roman"/>
+          <w:lang w:val="ru-RU"/>
+        </w:rPr>
+        <w:t>аук</w:t>
+      </w:r>
+      <w:r>
+        <w:rPr>
+          <w:rFonts w:ascii="Times New Roman" w:hAnsi="Times New Roman" w:cs="Times New Roman"/>
+          <w:lang w:val="ru-RU"/>
+        </w:rPr>
+        <w:t>и</w:t>
+      </w:r>
+      <w:r>
+        <w:rPr>
+          <w:rFonts w:ascii="Times New Roman" w:hAnsi="Times New Roman" w:cs="Times New Roman"/>
+          <w:lang w:val="ru-RU"/>
+        </w:rPr>
+        <w:t xml:space="preserve"> </w:t>
+      </w:r>
+      <w:r>
+        <w:rPr>
+          <w:rFonts w:ascii="Times New Roman" w:hAnsi="Times New Roman" w:cs="Times New Roman"/>
+          <w:lang w:val="ru-RU"/>
+        </w:rPr>
+        <w:t xml:space="preserve">— </w:t>
+      </w:r>
+      <w:r>
+        <w:rPr>
+          <w:rFonts w:ascii="Times New Roman" w:hAnsi="Times New Roman" w:cs="Times New Roman"/>
+          <w:lang w:val="ru-RU"/>
+        </w:rPr>
+        <w:t>сделать так, чтобы</w:t>
+      </w:r>
+      <w:r>
+        <w:rPr>
+          <w:rFonts w:ascii="Times New Roman" w:hAnsi="Times New Roman" w:cs="Times New Roman"/>
+          <w:lang w:val="ru-RU"/>
+        </w:rPr>
+        <w:t xml:space="preserve"> влияние субъекта</w:t>
+      </w:r>
+      <w:r>
+        <w:rPr>
+          <w:rFonts w:ascii="Times New Roman" w:hAnsi="Times New Roman" w:cs="Times New Roman"/>
+          <w:lang w:val="ru-RU"/>
+        </w:rPr>
+        <w:t xml:space="preserve"> на изучение природы было минимально</w:t>
+      </w:r>
+      <w:r>
+        <w:rPr>
+          <w:rFonts w:ascii="Times New Roman" w:hAnsi="Times New Roman" w:cs="Times New Roman"/>
+          <w:lang w:val="ru-RU"/>
+        </w:rPr>
+        <w:t>.</w:t>
+      </w:r>
+      <w:r>
+        <w:rPr>
+          <w:rFonts w:ascii="Times New Roman" w:hAnsi="Times New Roman" w:cs="Times New Roman"/>
+          <w:lang w:val="ru-RU"/>
+        </w:rPr>
+        <w:t xml:space="preserve"> Это не значит, что субъекта в науке нет</w:t>
+      </w:r>
+      <w:r>
+        <w:rPr>
+          <w:rFonts w:ascii="Times New Roman" w:hAnsi="Times New Roman" w:cs="Times New Roman"/>
+          <w:lang w:val="ru-RU"/>
+        </w:rPr>
+        <w:t>. Е</w:t>
+      </w:r>
+      <w:r>
+        <w:rPr>
+          <w:rFonts w:ascii="Times New Roman" w:hAnsi="Times New Roman" w:cs="Times New Roman"/>
+          <w:lang w:val="ru-RU"/>
+        </w:rPr>
+        <w:t>го пытаются вывести из эксперимента, «взять за скобки»</w:t>
+      </w:r>
+      <w:r>
+        <w:rPr>
+          <w:rFonts w:ascii="Times New Roman" w:hAnsi="Times New Roman" w:cs="Times New Roman"/>
+          <w:lang w:val="ru-RU"/>
+        </w:rPr>
+        <w:t>, чтобы смоделировать ситуацию, в которой можно изуч</w:t>
+      </w:r>
+      <w:r>
+        <w:rPr>
+          <w:rFonts w:ascii="Times New Roman" w:hAnsi="Times New Roman" w:cs="Times New Roman"/>
+          <w:lang w:val="ru-RU"/>
+        </w:rPr>
+        <w:t>и</w:t>
+      </w:r>
+      <w:r>
+        <w:rPr>
+          <w:rFonts w:ascii="Times New Roman" w:hAnsi="Times New Roman" w:cs="Times New Roman"/>
+          <w:lang w:val="ru-RU"/>
+        </w:rPr>
+        <w:t>ть объект без его вмешательства</w:t>
+      </w:r>
+      <w:r>
+        <w:rPr>
+          <w:rFonts w:ascii="Times New Roman" w:hAnsi="Times New Roman" w:cs="Times New Roman"/>
+          <w:lang w:val="ru-RU"/>
+        </w:rPr>
+        <w:t xml:space="preserve">, и вывести на основе этого </w:t>
+      </w:r>
+      <w:r>
+        <w:rPr>
+          <w:rFonts w:ascii="Times New Roman" w:hAnsi="Times New Roman" w:cs="Times New Roman"/>
+          <w:i/>
+          <w:iCs/>
+          <w:lang w:val="ru-RU"/>
+        </w:rPr>
+        <w:t>законы</w:t>
+      </w:r>
+      <w:r>
+        <w:rPr>
+          <w:rFonts w:ascii="Times New Roman" w:hAnsi="Times New Roman" w:cs="Times New Roman"/>
+          <w:lang w:val="ru-RU"/>
+        </w:rPr>
+        <w:t>.</w:t>
+      </w:r>
+      <w:r>
+        <w:rPr>
+          <w:rFonts w:ascii="Times New Roman" w:hAnsi="Times New Roman" w:cs="Times New Roman"/>
+          <w:lang w:val="ru-RU"/>
+        </w:rPr>
+        <w:t xml:space="preserve"> </w:t>
+      </w:r>
+      <w:r>
+        <w:rPr>
+          <w:rFonts w:ascii="Times New Roman" w:hAnsi="Times New Roman" w:cs="Times New Roman"/>
+          <w:u w:val="single"/>
+          <w:lang w:val="ru-RU"/>
+        </w:rPr>
+        <w:t>С точки зрения Юма наука слишком метафизична и традиционна</w:t>
+      </w:r>
+      <w:r>
+        <w:rPr>
+          <w:rFonts w:ascii="Times New Roman" w:hAnsi="Times New Roman" w:cs="Times New Roman"/>
+          <w:u w:val="single"/>
+          <w:lang w:val="ru-RU"/>
+        </w:rPr>
+        <w:t>, потому что исходит из субъектно-объектной модели.</w:t>
+      </w:r>
+      <w:r>
+        <w:rPr>
+          <w:rFonts w:ascii="Times New Roman" w:hAnsi="Times New Roman" w:cs="Times New Roman"/>
+          <w:u w:val="single"/>
+          <w:lang w:val="ru-RU"/>
+        </w:rPr>
+        <w:t xml:space="preserve"> </w:t>
+      </w:r>
+      <w:r>
+        <w:rPr>
+          <w:rFonts w:ascii="Times New Roman" w:hAnsi="Times New Roman" w:cs="Times New Roman"/>
+          <w:lang w:val="ru-RU"/>
+        </w:rPr>
+        <w:t>Те результаты, которых наука достигает</w:t>
+      </w:r>
+      <w:r>
+        <w:rPr>
+          <w:rFonts w:ascii="Times New Roman" w:hAnsi="Times New Roman" w:cs="Times New Roman"/>
+          <w:lang w:val="ru-RU"/>
+        </w:rPr>
+        <w:t xml:space="preserve">, являются </w:t>
+      </w:r>
+      <w:r>
+        <w:rPr>
+          <w:rFonts w:ascii="Times New Roman" w:hAnsi="Times New Roman" w:cs="Times New Roman"/>
+          <w:lang w:val="ru-RU"/>
+        </w:rPr>
+        <w:t>глубоко вторичными</w:t>
+      </w:r>
+      <w:r>
+        <w:rPr>
+          <w:rFonts w:ascii="Times New Roman" w:hAnsi="Times New Roman" w:cs="Times New Roman"/>
+          <w:lang w:val="ru-RU"/>
+        </w:rPr>
+        <w:t>, потому что главный теоретический объект, из которого возника</w:t>
+      </w:r>
+      <w:r>
+        <w:rPr>
+          <w:rFonts w:ascii="Times New Roman" w:hAnsi="Times New Roman" w:cs="Times New Roman"/>
+          <w:lang w:val="ru-RU"/>
+        </w:rPr>
+        <w:t>ют и</w:t>
+      </w:r>
+      <w:r>
+        <w:rPr>
+          <w:rFonts w:ascii="Times New Roman" w:hAnsi="Times New Roman" w:cs="Times New Roman"/>
+          <w:lang w:val="ru-RU"/>
+        </w:rPr>
+        <w:t xml:space="preserve"> </w:t>
+      </w:r>
+      <w:r>
+        <w:rPr>
+          <w:rFonts w:ascii="Times New Roman" w:hAnsi="Times New Roman" w:cs="Times New Roman"/>
+          <w:lang w:val="ru-RU"/>
+        </w:rPr>
+        <w:t>субъект,</w:t>
+      </w:r>
+      <w:r>
+        <w:rPr>
+          <w:rFonts w:ascii="Times New Roman" w:hAnsi="Times New Roman" w:cs="Times New Roman"/>
+          <w:lang w:val="ru-RU"/>
+        </w:rPr>
+        <w:t xml:space="preserve"> и объект — это </w:t>
+      </w:r>
+      <w:r>
+        <w:rPr>
+          <w:rFonts w:ascii="Times New Roman" w:hAnsi="Times New Roman" w:cs="Times New Roman"/>
+          <w:i/>
+          <w:iCs/>
+        </w:rPr>
+        <w:t>human</w:t>
+      </w:r>
+      <w:r>
+        <w:rPr>
+          <w:rFonts w:ascii="Times New Roman" w:hAnsi="Times New Roman" w:cs="Times New Roman"/>
+          <w:i/>
+          <w:iCs/>
+          <w:lang w:val="ru-RU"/>
+        </w:rPr>
+        <w:t xml:space="preserve"> </w:t>
+      </w:r>
+      <w:r>
+        <w:rPr>
+          <w:rFonts w:ascii="Times New Roman" w:hAnsi="Times New Roman" w:cs="Times New Roman"/>
+          <w:i/>
+          <w:iCs/>
+        </w:rPr>
+        <w:t>nature</w:t>
+      </w:r>
+      <w:r>
+        <w:rPr>
+          <w:rFonts w:ascii="Times New Roman" w:hAnsi="Times New Roman" w:cs="Times New Roman"/>
+          <w:lang w:val="ru-RU"/>
+        </w:rPr>
+        <w:t>.</w:t>
+      </w:r>
+      <w:r>
+        <w:rPr>
+          <w:rFonts w:ascii="Times New Roman" w:hAnsi="Times New Roman" w:cs="Times New Roman"/>
+          <w:lang w:val="ru-RU"/>
+        </w:rPr>
+        <w:t xml:space="preserve"> У философ</w:t>
+      </w:r>
+      <w:r>
+        <w:rPr>
+          <w:rFonts w:ascii="Times New Roman" w:hAnsi="Times New Roman" w:cs="Times New Roman"/>
+          <w:lang w:val="ru-RU"/>
+        </w:rPr>
+        <w:t>ии</w:t>
+      </w:r>
+      <w:r>
+        <w:rPr>
+          <w:rFonts w:ascii="Times New Roman" w:hAnsi="Times New Roman" w:cs="Times New Roman"/>
+          <w:lang w:val="ru-RU"/>
+        </w:rPr>
+        <w:t xml:space="preserve"> отныне есть свой собственный </w:t>
+      </w:r>
+      <w:r>
+        <w:rPr>
+          <w:rFonts w:ascii="Times New Roman" w:hAnsi="Times New Roman" w:cs="Times New Roman"/>
+          <w:lang w:val="ru-RU"/>
+        </w:rPr>
+        <w:t>предмет</w:t>
+      </w:r>
+      <w:r>
+        <w:rPr>
+          <w:rFonts w:ascii="Times New Roman" w:hAnsi="Times New Roman" w:cs="Times New Roman"/>
+          <w:lang w:val="ru-RU"/>
+        </w:rPr>
+        <w:t>, который не совпадает с</w:t>
+      </w:r>
+      <w:r>
+        <w:rPr>
+          <w:rFonts w:ascii="Times New Roman" w:hAnsi="Times New Roman" w:cs="Times New Roman"/>
+          <w:lang w:val="ru-RU"/>
+        </w:rPr>
+        <w:t xml:space="preserve"> предметом</w:t>
+      </w:r>
+      <w:r>
+        <w:rPr>
+          <w:rFonts w:ascii="Times New Roman" w:hAnsi="Times New Roman" w:cs="Times New Roman"/>
+          <w:lang w:val="ru-RU"/>
+        </w:rPr>
+        <w:t xml:space="preserve"> ЭН</w:t>
+      </w:r>
+      <w:r>
+        <w:rPr>
+          <w:rFonts w:ascii="Times New Roman" w:hAnsi="Times New Roman" w:cs="Times New Roman"/>
+          <w:lang w:val="ru-RU"/>
+        </w:rPr>
+        <w:t>;</w:t>
+      </w:r>
+      <w:r>
+        <w:rPr>
+          <w:rFonts w:ascii="Times New Roman" w:hAnsi="Times New Roman" w:cs="Times New Roman"/>
+          <w:lang w:val="ru-RU"/>
+        </w:rPr>
+        <w:t xml:space="preserve"> </w:t>
+      </w:r>
+      <w:r>
+        <w:rPr>
+          <w:rFonts w:ascii="Times New Roman" w:hAnsi="Times New Roman" w:cs="Times New Roman"/>
+          <w:lang w:val="ru-RU"/>
+        </w:rPr>
+        <w:t>философ настаивает, что его предмет первичный и главный.</w:t>
+      </w:r>
+      <w:r>
+        <w:rPr>
+          <w:rFonts w:ascii="Times New Roman" w:hAnsi="Times New Roman" w:cs="Times New Roman"/>
+          <w:lang w:val="ru-RU"/>
+        </w:rPr>
+        <w:t xml:space="preserve"> Законы для Юма — это не законы в привычном смысле слов</w:t>
+      </w:r>
+      <w:r>
+        <w:rPr>
+          <w:rFonts w:ascii="Times New Roman" w:hAnsi="Times New Roman" w:cs="Times New Roman"/>
+          <w:lang w:val="ru-RU"/>
+        </w:rPr>
+        <w:t>а, н</w:t>
+      </w:r>
+      <w:r>
+        <w:rPr>
+          <w:rFonts w:ascii="Times New Roman" w:hAnsi="Times New Roman" w:cs="Times New Roman"/>
+          <w:lang w:val="ru-RU"/>
+        </w:rPr>
+        <w:t>о вероятностное знание</w:t>
+      </w:r>
+      <w:r>
+        <w:rPr>
+          <w:rFonts w:ascii="Times New Roman" w:hAnsi="Times New Roman" w:cs="Times New Roman"/>
+          <w:lang w:val="ru-RU"/>
+        </w:rPr>
+        <w:t>; это и предстоит исследовать далее.</w:t>
+      </w:r>
+    </w:p>
+    <w:p>
+      <w:pPr>
+        <w:pStyle w:val="Heading2"/>
+        <w:rPr>
+          <w:lang w:val="ru-RU"/>
+        </w:rPr>
+      </w:pPr>
+      <w:r>
+        <w:rPr>
+          <w:lang w:val="ru-RU"/>
+        </w:rPr>
+        <w:t>Юм и научное знание</w:t>
+      </w:r>
+    </w:p>
+    <w:p>
+      <w:pPr>
+        <w:rPr>
+          <w:rFonts w:ascii="Times New Roman" w:hAnsi="Times New Roman" w:cs="Times New Roman"/>
+          <w:lang w:val="ru-RU"/>
+        </w:rPr>
+      </w:pPr>
+      <w:r>
+        <w:rPr>
+          <w:rFonts w:ascii="Times New Roman" w:hAnsi="Times New Roman" w:cs="Times New Roman"/>
+          <w:lang w:val="ru-RU"/>
+        </w:rPr>
+        <w:t>Итак, первое, что хочется сделать — подавить Юма авторитетом научного знания</w:t>
+      </w:r>
+      <w:r>
+        <w:rPr>
+          <w:rFonts w:ascii="Times New Roman" w:hAnsi="Times New Roman" w:cs="Times New Roman"/>
+          <w:lang w:val="ru-RU"/>
+        </w:rPr>
+        <w:t>, тем более что с</w:t>
+      </w:r>
+      <w:r>
+        <w:rPr>
+          <w:rFonts w:ascii="Times New Roman" w:hAnsi="Times New Roman" w:cs="Times New Roman"/>
+          <w:lang w:val="ru-RU"/>
+        </w:rPr>
+        <w:t xml:space="preserve">ам Юм был гуманитарием в полном смысле этого слова. Во введении к своей </w:t>
+      </w:r>
+      <w:r>
+        <w:rPr>
+          <w:rFonts w:ascii="Times New Roman" w:hAnsi="Times New Roman" w:cs="Times New Roman"/>
+          <w:lang w:val="ru-RU"/>
+        </w:rPr>
+        <w:t xml:space="preserve">книге он с уважением относится к Ньютону, говоря, что </w:t>
+      </w:r>
+      <w:r>
+        <w:rPr>
+          <w:rFonts w:ascii="Times New Roman" w:hAnsi="Times New Roman" w:cs="Times New Roman"/>
+          <w:lang w:val="ru-RU"/>
+        </w:rPr>
+        <w:t>исследование естественной природы</w:t>
+      </w:r>
+      <w:r>
+        <w:rPr>
+          <w:rFonts w:ascii="Times New Roman" w:hAnsi="Times New Roman" w:cs="Times New Roman"/>
+          <w:lang w:val="ru-RU"/>
+        </w:rPr>
+        <w:t xml:space="preserve"> также необходимо, как и</w:t>
+      </w:r>
+      <w:r>
+        <w:rPr>
+          <w:rFonts w:ascii="Times New Roman" w:hAnsi="Times New Roman" w:cs="Times New Roman"/>
+          <w:lang w:val="ru-RU"/>
+        </w:rPr>
+        <w:t xml:space="preserve"> </w:t>
+      </w:r>
+      <w:r>
+        <w:rPr>
+          <w:rFonts w:ascii="Times New Roman" w:hAnsi="Times New Roman" w:cs="Times New Roman"/>
+          <w:lang w:val="ru-RU"/>
+        </w:rPr>
+        <w:t xml:space="preserve">исследование человеческой природы </w:t>
+      </w:r>
+      <w:r>
+        <w:rPr>
+          <w:rFonts w:ascii="Times New Roman" w:hAnsi="Times New Roman" w:cs="Times New Roman"/>
+          <w:i/>
+          <w:iCs/>
+        </w:rPr>
+        <w:t>human</w:t>
+      </w:r>
+      <w:r>
+        <w:rPr>
+          <w:rFonts w:ascii="Times New Roman" w:hAnsi="Times New Roman" w:cs="Times New Roman"/>
+          <w:i/>
+          <w:iCs/>
+          <w:lang w:val="ru-RU"/>
+        </w:rPr>
+        <w:t xml:space="preserve"> </w:t>
+      </w:r>
+      <w:r>
+        <w:rPr>
+          <w:rFonts w:ascii="Times New Roman" w:hAnsi="Times New Roman" w:cs="Times New Roman"/>
+          <w:i/>
+          <w:iCs/>
+        </w:rPr>
+        <w:t>nature</w:t>
+      </w:r>
+      <w:r>
+        <w:rPr>
+          <w:rFonts w:ascii="Times New Roman" w:hAnsi="Times New Roman" w:cs="Times New Roman"/>
+          <w:lang w:val="ru-RU"/>
+        </w:rPr>
+        <w:t>.</w:t>
+      </w:r>
+      <w:r>
+        <w:rPr>
+          <w:rFonts w:ascii="Times New Roman" w:hAnsi="Times New Roman" w:cs="Times New Roman"/>
+          <w:lang w:val="ru-RU"/>
+        </w:rPr>
+        <w:t xml:space="preserve"> </w:t>
+      </w:r>
+      <w:r>
+        <w:rPr>
+          <w:rFonts w:ascii="Times New Roman" w:hAnsi="Times New Roman" w:cs="Times New Roman"/>
+          <w:lang w:val="ru-RU"/>
+        </w:rPr>
+        <w:t xml:space="preserve">Кажется, что такое вступление </w:t>
+      </w:r>
+      <w:r>
+        <w:rPr>
+          <w:rFonts w:ascii="Times New Roman" w:hAnsi="Times New Roman" w:cs="Times New Roman"/>
+          <w:lang w:val="ru-RU"/>
+        </w:rPr>
+        <w:t xml:space="preserve">— </w:t>
+      </w:r>
+      <w:r>
+        <w:rPr>
+          <w:rFonts w:ascii="Times New Roman" w:hAnsi="Times New Roman" w:cs="Times New Roman"/>
+          <w:lang w:val="ru-RU"/>
+        </w:rPr>
+        <w:t xml:space="preserve">это реверанс уважения к Ньютону, </w:t>
+      </w:r>
+      <w:r>
+        <w:rPr>
+          <w:rFonts w:ascii="Times New Roman" w:hAnsi="Times New Roman" w:cs="Times New Roman"/>
+          <w:lang w:val="ru-RU"/>
+        </w:rPr>
+        <w:t>но на самом деле это жест разделения; демонстрация того, что это совершенно не одно и тоже.</w:t>
+      </w:r>
+    </w:p>
+    <w:p>
+      <w:pPr>
+        <w:rPr>
+          <w:rFonts w:ascii="Times New Roman" w:hAnsi="Times New Roman" w:cs="Times New Roman"/>
+          <w:lang w:val="ru-RU"/>
+        </w:rPr>
+      </w:pPr>
+      <w:r>
+        <w:rPr>
+          <w:rFonts w:ascii="Times New Roman" w:hAnsi="Times New Roman" w:cs="Times New Roman"/>
+          <w:lang w:val="ru-RU"/>
+        </w:rPr>
+        <w:t xml:space="preserve">Есть несколько случаев, которые показывают, каковы результаты </w:t>
+      </w:r>
+      <w:r>
+        <w:rPr>
+          <w:rFonts w:ascii="Times New Roman" w:hAnsi="Times New Roman" w:cs="Times New Roman"/>
+          <w:lang w:val="ru-RU"/>
+        </w:rPr>
+        <w:t>противостояния скепсиса</w:t>
+      </w:r>
+      <w:r>
+        <w:rPr>
+          <w:rFonts w:ascii="Times New Roman" w:hAnsi="Times New Roman" w:cs="Times New Roman"/>
+          <w:lang w:val="ru-RU"/>
+        </w:rPr>
+        <w:t xml:space="preserve"> Юма с наукой.</w:t>
+      </w:r>
+    </w:p>
+    <w:p>
+      <w:pPr>
+        <w:pStyle w:val="Heading3"/>
+        <w:rPr>
+          <w:lang w:val="ru-RU"/>
+        </w:rPr>
+      </w:pPr>
+      <w:r>
+        <w:rPr>
+          <w:lang w:val="ru-RU"/>
+        </w:rPr>
+        <w:t>Случай первый</w:t>
+      </w:r>
+      <w:r>
+        <w:rPr>
+          <w:lang w:val="ru-RU"/>
+        </w:rPr>
+        <w:t xml:space="preserve">. </w:t>
+      </w:r>
+      <w:r>
+        <w:rPr>
+          <w:lang w:val="ru-RU"/>
+        </w:rPr>
+        <w:t xml:space="preserve">Юм </w:t>
+      </w:r>
+      <w:r>
+        <w:t>VS</w:t>
+      </w:r>
+      <w:r>
+        <w:rPr>
+          <w:lang w:val="ru-RU"/>
+        </w:rPr>
+        <w:t xml:space="preserve"> Эйнштейн</w:t>
+      </w:r>
+    </w:p>
+    <w:p>
+      <w:pPr>
+        <w:rPr>
+          <w:rFonts w:ascii="Times New Roman" w:hAnsi="Times New Roman" w:cs="Times New Roman"/>
+          <w:sz w:val="24"/>
+          <w:szCs w:val="24"/>
+          <w:lang w:val="ru-RU"/>
+        </w:rPr>
+      </w:pPr>
+      <w:r>
+        <w:rPr>
+          <w:rFonts w:ascii="Times New Roman" w:hAnsi="Times New Roman" w:cs="Times New Roman"/>
+          <w:sz w:val="24"/>
+          <w:szCs w:val="24"/>
+          <w:lang w:val="ru-RU"/>
+        </w:rPr>
+        <w:t>Эйнштейн — это один из немногих философствующих физиков; он знал и ценил труды Юма</w:t>
+      </w:r>
+      <w:r>
+        <w:rPr>
+          <w:rFonts w:ascii="Times New Roman" w:hAnsi="Times New Roman" w:cs="Times New Roman"/>
+          <w:sz w:val="24"/>
+          <w:szCs w:val="24"/>
+          <w:lang w:val="ru-RU"/>
+        </w:rPr>
+        <w:t>.</w:t>
+      </w:r>
+      <w:r>
+        <w:rPr>
+          <w:rFonts w:ascii="Times New Roman" w:hAnsi="Times New Roman" w:cs="Times New Roman"/>
+          <w:sz w:val="24"/>
+          <w:szCs w:val="24"/>
+          <w:lang w:val="ru-RU"/>
+        </w:rPr>
+        <w:t xml:space="preserve"> Начнем с такого базового понятия физики, без которого немыслима классическая механика, как сила</w:t>
+      </w:r>
+      <w:r>
+        <w:rPr>
+          <w:rFonts w:ascii="Times New Roman" w:hAnsi="Times New Roman" w:cs="Times New Roman"/>
+          <w:sz w:val="24"/>
+          <w:szCs w:val="24"/>
+          <w:lang w:val="ru-RU"/>
+        </w:rPr>
+        <w:t>:</w:t>
+      </w:r>
+    </w:p>
+    <w:p>
+      <w:pPr>
+        <w:jc w:val="center"/>
+        <w:rPr>
+          <w:rFonts w:ascii="Times New Roman" w:hAnsi="Times New Roman" w:cs="Times New Roman"/>
+          <w:b/>
+          <w:bCs/>
+          <w:i/>
+          <w:iCs/>
+          <w:sz w:val="24"/>
+          <w:szCs w:val="24"/>
+          <w:lang w:val="ru-RU"/>
+        </w:rPr>
+      </w:pPr>
+      <w:r>
+        <w:rPr>
+          <w:rFonts w:ascii="Times New Roman" w:hAnsi="Times New Roman" w:cs="Times New Roman"/>
+          <w:b/>
+          <w:bCs/>
+          <w:i/>
+          <w:iCs/>
+          <w:sz w:val="24"/>
+          <w:szCs w:val="24"/>
+        </w:rPr>
+        <w:t>F</w:t>
+      </w:r>
+      <w:r>
+        <w:rPr>
+          <w:rFonts w:ascii="Times New Roman" w:hAnsi="Times New Roman" w:cs="Times New Roman"/>
+          <w:b/>
+          <w:bCs/>
+          <w:i/>
+          <w:iCs/>
+          <w:sz w:val="24"/>
+          <w:szCs w:val="24"/>
+          <w:lang w:val="ru-RU"/>
+        </w:rPr>
+        <w:t>=</w:t>
+      </w:r>
+      <w:r>
+        <w:rPr>
+          <w:rFonts w:ascii="Times New Roman" w:hAnsi="Times New Roman" w:cs="Times New Roman"/>
+          <w:b/>
+          <w:bCs/>
+          <w:i/>
+          <w:iCs/>
+          <w:sz w:val="24"/>
+          <w:szCs w:val="24"/>
+        </w:rPr>
+        <w:t>ma</w:t>
+      </w:r>
+    </w:p>
+    <w:p>
+      <w:pPr>
+        <w:rPr>
+          <w:rFonts w:ascii="Times New Roman" w:hAnsi="Times New Roman" w:cs="Times New Roman"/>
+          <w:sz w:val="24"/>
+          <w:szCs w:val="24"/>
+          <w:lang w:val="ru-RU"/>
+        </w:rPr>
+      </w:pPr>
+      <w:r>
+        <w:rPr>
+          <w:rFonts w:ascii="Times New Roman" w:hAnsi="Times New Roman" w:cs="Times New Roman"/>
+          <w:sz w:val="24"/>
+          <w:szCs w:val="24"/>
+          <w:lang w:val="ru-RU"/>
+        </w:rPr>
+        <w:t>По поводу силы между Юмом и ЭН сразу же возникают серьезнейшие разночтения.</w:t>
+      </w:r>
+      <w:r>
+        <w:rPr>
+          <w:rFonts w:ascii="Times New Roman" w:hAnsi="Times New Roman" w:cs="Times New Roman"/>
+          <w:sz w:val="24"/>
+          <w:szCs w:val="24"/>
+          <w:lang w:val="ru-RU"/>
+        </w:rPr>
+        <w:t xml:space="preserve"> Возьмем пример с бильярдными шарами: есть два шара, движущийся и покоящийся. Один ударяет другой, в итоге первый меняет направление, а второй </w:t>
+      </w:r>
+      <w:r>
+        <w:rPr>
+          <w:rFonts w:ascii="Times New Roman" w:hAnsi="Times New Roman" w:cs="Times New Roman"/>
+          <w:sz w:val="24"/>
+          <w:szCs w:val="24"/>
+          <w:lang w:val="ru-RU"/>
+        </w:rPr>
+        <w:t>приводится в движение</w:t>
+      </w:r>
+      <w:r>
+        <w:rPr>
+          <w:rFonts w:ascii="Times New Roman" w:hAnsi="Times New Roman" w:cs="Times New Roman"/>
+          <w:sz w:val="24"/>
+          <w:szCs w:val="24"/>
+          <w:lang w:val="ru-RU"/>
+        </w:rPr>
+        <w:t>.</w:t>
+      </w:r>
+      <w:r>
+        <w:rPr>
+          <w:rFonts w:ascii="Times New Roman" w:hAnsi="Times New Roman" w:cs="Times New Roman"/>
+          <w:sz w:val="24"/>
+          <w:szCs w:val="24"/>
+          <w:lang w:val="ru-RU"/>
+        </w:rPr>
+        <w:t xml:space="preserve"> Почему это произошло? </w:t>
+      </w:r>
+      <w:r>
+        <w:rPr>
+          <w:rFonts w:ascii="Times New Roman" w:hAnsi="Times New Roman" w:cs="Times New Roman"/>
+          <w:sz w:val="24"/>
+          <w:szCs w:val="24"/>
+          <w:lang w:val="ru-RU"/>
+        </w:rPr>
+        <w:t xml:space="preserve">С точки зрения </w:t>
+      </w:r>
+      <w:r>
+        <w:rPr>
+          <w:rFonts w:ascii="Times New Roman" w:hAnsi="Times New Roman" w:cs="Times New Roman"/>
+          <w:sz w:val="24"/>
+          <w:szCs w:val="24"/>
+          <w:lang w:val="ru-RU"/>
+        </w:rPr>
+        <w:t>ЭН, потому что</w:t>
+      </w:r>
+      <w:r>
+        <w:rPr>
+          <w:rFonts w:ascii="Times New Roman" w:hAnsi="Times New Roman" w:cs="Times New Roman"/>
+          <w:sz w:val="24"/>
+          <w:szCs w:val="24"/>
+          <w:lang w:val="ru-RU"/>
+        </w:rPr>
+        <w:t xml:space="preserve"> </w:t>
+      </w:r>
+      <w:r>
+        <w:rPr>
+          <w:rFonts w:ascii="Times New Roman" w:hAnsi="Times New Roman" w:cs="Times New Roman"/>
+          <w:sz w:val="24"/>
+          <w:szCs w:val="24"/>
+          <w:lang w:val="ru-RU"/>
+        </w:rPr>
+        <w:t xml:space="preserve">сила первого шара </w:t>
+      </w:r>
+      <w:r>
+        <w:rPr>
+          <w:rFonts w:ascii="Times New Roman" w:hAnsi="Times New Roman" w:cs="Times New Roman"/>
+          <w:sz w:val="24"/>
+          <w:szCs w:val="24"/>
+          <w:lang w:val="ru-RU"/>
+        </w:rPr>
+        <w:t xml:space="preserve">действовала </w:t>
+      </w:r>
+      <w:r>
+        <w:rPr>
+          <w:rFonts w:ascii="Times New Roman" w:hAnsi="Times New Roman" w:cs="Times New Roman"/>
+          <w:sz w:val="24"/>
+          <w:szCs w:val="24"/>
+          <w:lang w:val="ru-RU"/>
+        </w:rPr>
+        <w:t>на второ</w:t>
+      </w:r>
+      <w:r>
+        <w:rPr>
+          <w:rFonts w:ascii="Times New Roman" w:hAnsi="Times New Roman" w:cs="Times New Roman"/>
+          <w:sz w:val="24"/>
+          <w:szCs w:val="24"/>
+          <w:lang w:val="ru-RU"/>
+        </w:rPr>
+        <w:t>й</w:t>
+      </w:r>
+      <w:r>
+        <w:rPr>
+          <w:rFonts w:ascii="Times New Roman" w:hAnsi="Times New Roman" w:cs="Times New Roman"/>
+          <w:sz w:val="24"/>
+          <w:szCs w:val="24"/>
+          <w:lang w:val="ru-RU"/>
+        </w:rPr>
+        <w:t>.</w:t>
+      </w:r>
+      <w:r>
+        <w:rPr>
+          <w:rFonts w:ascii="Times New Roman" w:hAnsi="Times New Roman" w:cs="Times New Roman"/>
+          <w:sz w:val="24"/>
+          <w:szCs w:val="24"/>
+          <w:lang w:val="ru-RU"/>
+        </w:rPr>
+        <w:t xml:space="preserve"> Юм не согласен с этим</w:t>
+      </w:r>
+      <w:r>
+        <w:rPr>
+          <w:rFonts w:ascii="Times New Roman" w:hAnsi="Times New Roman" w:cs="Times New Roman"/>
+          <w:sz w:val="24"/>
+          <w:szCs w:val="24"/>
+          <w:lang w:val="ru-RU"/>
+        </w:rPr>
+        <w:t>, ведь</w:t>
+      </w:r>
+      <w:r>
+        <w:rPr>
+          <w:rFonts w:ascii="Times New Roman" w:hAnsi="Times New Roman" w:cs="Times New Roman"/>
+          <w:sz w:val="24"/>
+          <w:szCs w:val="24"/>
+          <w:lang w:val="ru-RU"/>
+        </w:rPr>
+        <w:t xml:space="preserve"> мы никогда не наблюдаем никакой силы; в нас нет </w:t>
+      </w:r>
+      <w:r>
+        <w:rPr>
+          <w:rFonts w:ascii="Times New Roman" w:hAnsi="Times New Roman" w:cs="Times New Roman"/>
+          <w:sz w:val="24"/>
+          <w:szCs w:val="24"/>
+          <w:lang w:val="ru-RU"/>
+        </w:rPr>
+        <w:lastRenderedPageBreak/>
+        <w:t xml:space="preserve">никакого </w:t>
+      </w:r>
+      <w:r>
+        <w:rPr>
+          <w:rFonts w:ascii="Times New Roman" w:hAnsi="Times New Roman" w:cs="Times New Roman"/>
+          <w:sz w:val="24"/>
+          <w:szCs w:val="24"/>
+          <w:lang w:val="ru-RU"/>
+        </w:rPr>
+        <w:t>опыта силы</w:t>
+      </w:r>
+      <w:r>
+        <w:rPr>
+          <w:rFonts w:ascii="Times New Roman" w:hAnsi="Times New Roman" w:cs="Times New Roman"/>
+          <w:sz w:val="24"/>
+          <w:szCs w:val="24"/>
+          <w:lang w:val="ru-RU"/>
+        </w:rPr>
+        <w:t xml:space="preserve"> </w:t>
+      </w:r>
+      <w:r>
+        <w:rPr>
+          <w:rFonts w:ascii="Times New Roman" w:hAnsi="Times New Roman" w:cs="Times New Roman"/>
+          <w:sz w:val="24"/>
+          <w:szCs w:val="24"/>
+          <w:lang w:val="ru-RU"/>
+        </w:rPr>
+        <w:t>действия, трения</w:t>
+      </w:r>
+      <w:r>
+        <w:rPr>
+          <w:rFonts w:ascii="Times New Roman" w:hAnsi="Times New Roman" w:cs="Times New Roman"/>
+          <w:sz w:val="24"/>
+          <w:szCs w:val="24"/>
+          <w:lang w:val="ru-RU"/>
+        </w:rPr>
+        <w:t xml:space="preserve"> или</w:t>
+      </w:r>
+      <w:r>
+        <w:rPr>
+          <w:rFonts w:ascii="Times New Roman" w:hAnsi="Times New Roman" w:cs="Times New Roman"/>
+          <w:sz w:val="24"/>
+          <w:szCs w:val="24"/>
+          <w:lang w:val="ru-RU"/>
+        </w:rPr>
+        <w:t xml:space="preserve"> гравитации.</w:t>
+      </w:r>
+      <w:r>
+        <w:rPr>
+          <w:rFonts w:ascii="Times New Roman" w:hAnsi="Times New Roman" w:cs="Times New Roman"/>
+          <w:sz w:val="24"/>
+          <w:szCs w:val="24"/>
+          <w:lang w:val="ru-RU"/>
+        </w:rPr>
+        <w:t xml:space="preserve"> Есть лишь </w:t>
+      </w:r>
+      <w:r>
+        <w:rPr>
+          <w:rFonts w:ascii="Times New Roman" w:hAnsi="Times New Roman" w:cs="Times New Roman"/>
+          <w:i/>
+          <w:iCs/>
+          <w:sz w:val="24"/>
+          <w:szCs w:val="24"/>
+          <w:lang w:val="ru-RU"/>
+        </w:rPr>
+        <w:t>вера</w:t>
+      </w:r>
+      <w:r>
+        <w:rPr>
+          <w:rFonts w:ascii="Times New Roman" w:hAnsi="Times New Roman" w:cs="Times New Roman"/>
+          <w:sz w:val="24"/>
+          <w:szCs w:val="24"/>
+          <w:lang w:val="ru-RU"/>
+        </w:rPr>
+        <w:t>, выработанная множеством повторений</w:t>
+      </w:r>
+      <w:r>
+        <w:rPr>
+          <w:rFonts w:ascii="Times New Roman" w:hAnsi="Times New Roman" w:cs="Times New Roman"/>
+          <w:sz w:val="24"/>
+          <w:szCs w:val="24"/>
+          <w:lang w:val="ru-RU"/>
+        </w:rPr>
+        <w:t>, а сила — фиктивное понятие</w:t>
+      </w:r>
+      <w:r>
+        <w:rPr>
+          <w:rFonts w:ascii="Times New Roman" w:hAnsi="Times New Roman" w:cs="Times New Roman"/>
+          <w:sz w:val="24"/>
+          <w:szCs w:val="24"/>
+          <w:lang w:val="ru-RU"/>
+        </w:rPr>
+        <w:t>.</w:t>
+      </w:r>
+      <w:r>
+        <w:rPr>
+          <w:rFonts w:ascii="Times New Roman" w:hAnsi="Times New Roman" w:cs="Times New Roman"/>
+          <w:sz w:val="24"/>
+          <w:szCs w:val="24"/>
+          <w:lang w:val="ru-RU"/>
+        </w:rPr>
+        <w:t xml:space="preserve"> </w:t>
+      </w:r>
+      <w:r>
+        <w:rPr>
+          <w:rFonts w:ascii="Times New Roman" w:hAnsi="Times New Roman" w:cs="Times New Roman"/>
+          <w:sz w:val="24"/>
+          <w:szCs w:val="24"/>
+          <w:lang w:val="ru-RU"/>
+        </w:rPr>
+        <w:t xml:space="preserve">Конечно же, </w:t>
+      </w:r>
+      <w:r>
+        <w:rPr>
+          <w:rFonts w:ascii="Times New Roman" w:hAnsi="Times New Roman" w:cs="Times New Roman"/>
+          <w:sz w:val="24"/>
+          <w:szCs w:val="24"/>
+          <w:lang w:val="ru-RU"/>
+        </w:rPr>
+        <w:t xml:space="preserve">Ньютон бы никогда не согласился с этим </w:t>
+      </w:r>
+      <w:r>
+        <w:rPr>
+          <w:rFonts w:ascii="Times New Roman" w:hAnsi="Times New Roman" w:cs="Times New Roman"/>
+          <w:sz w:val="24"/>
+          <w:szCs w:val="24"/>
+          <w:lang w:val="ru-RU"/>
+        </w:rPr>
+        <w:t>суждением</w:t>
+      </w:r>
+      <w:r>
+        <w:rPr>
+          <w:rFonts w:ascii="Times New Roman" w:hAnsi="Times New Roman" w:cs="Times New Roman"/>
+          <w:sz w:val="24"/>
+          <w:szCs w:val="24"/>
+          <w:lang w:val="ru-RU"/>
+        </w:rPr>
+        <w:t>.</w:t>
+      </w:r>
+    </w:p>
+    <w:p>
+      <w:pPr>
+        <w:rPr>
+          <w:rFonts w:ascii="Times New Roman" w:hAnsi="Times New Roman" w:cs="Times New Roman"/>
+          <w:sz w:val="24"/>
+          <w:szCs w:val="24"/>
+          <w:lang w:val="ru-RU"/>
+        </w:rPr>
+      </w:pPr>
+      <w:r>
+        <w:rPr>
+          <w:rFonts w:ascii="Times New Roman" w:hAnsi="Times New Roman" w:cs="Times New Roman"/>
+          <w:sz w:val="24"/>
+          <w:szCs w:val="24"/>
+          <w:lang w:val="ru-RU"/>
+        </w:rPr>
+        <w:t>Общая теория относительности (ОТО)</w:t>
       </w:r>
     </w:p>
     <w:sectPr>

</xml_diff>